<commit_message>
Corriger l'ui et la génération
</commit_message>
<xml_diff>
--- a/app/reports/template_page_de_garde.docx
+++ b/app/reports/template_page_de_garde.docx
@@ -67,7 +67,46 @@
           <w:szCs w:val="56"/>
           <w:lang w:val="fr-FR" w:eastAsia="en-US" w:bidi="ar-SA"/>
         </w:rPr>
-        <w:t>2024 - 2025</w:t>
+        <w:t>202</w:t>
+      </w:r>
+      <w:r>
+        <w:rPr>
+          <w:rFonts w:ascii="Verdana" w:hAnsi="Verdana"/>
+          <w:b/>
+          <w:i/>
+          <w:color w:val="00B0F0"/>
+          <w:spacing w:val="15"/>
+          <w:sz w:val="56"/>
+          <w:szCs w:val="56"/>
+          <w:lang w:val="fr-FR" w:eastAsia="en-US" w:bidi="ar-SA"/>
+        </w:rPr>
+        <w:t>5</w:t>
+      </w:r>
+      <w:r>
+        <w:rPr>
+          <w:rFonts w:ascii="Verdana" w:hAnsi="Verdana"/>
+          <w:b/>
+          <w:i/>
+          <w:color w:val="00B0F0"/>
+          <w:spacing w:val="15"/>
+          <w:sz w:val="56"/>
+          <w:szCs w:val="56"/>
+          <w:lang w:val="fr-FR" w:eastAsia="en-US" w:bidi="ar-SA"/>
+        </w:rPr>
+        <w:t xml:space="preserve"> - 202</w:t>
+      </w:r>
+      <w:r>
+        <w:rPr>
+          <w:rFonts w:ascii="Verdana" w:hAnsi="Verdana"/>
+          <w:b/>
+          <w:i/>
+          <w:color w:val="00B0F0"/>
+          <w:spacing w:val="15"/>
+          <w:sz w:val="56"/>
+          <w:szCs w:val="56"/>
+          <w:lang w:val="fr-FR" w:eastAsia="en-US" w:bidi="ar-SA"/>
+        </w:rPr>
+        <w:t>6</w:t>
       </w:r>
     </w:p>
     <w:p>
@@ -203,7 +242,7 @@
         <mc:AlternateContent>
           <mc:Choice Requires="wps">
             <w:drawing>
-              <wp:anchor behindDoc="0" distT="0" distB="0" distL="0" distR="0" simplePos="0" locked="0" layoutInCell="1" allowOverlap="1" relativeHeight="9">
+              <wp:anchor behindDoc="0" distT="0" distB="0" distL="0" distR="0" simplePos="0" locked="0" layoutInCell="1" allowOverlap="1" relativeHeight="10">
                 <wp:simplePos x="0" y="0"/>
                 <wp:positionH relativeFrom="column">
                   <wp:posOffset>213995</wp:posOffset>
@@ -489,12 +528,10 @@
     </w:pPr>
     <w:r>
       <w:rPr/>
-    </w:r>
-    <w:r>
       <mc:AlternateContent>
         <mc:Choice Requires="wps">
           <w:drawing>
-            <wp:anchor behindDoc="0" distT="0" distB="0" distL="0" distR="0" simplePos="0" locked="0" layoutInCell="1" allowOverlap="1" relativeHeight="0">
+            <wp:anchor behindDoc="1" distT="0" distB="0" distL="0" distR="0" simplePos="0" locked="0" layoutInCell="0" allowOverlap="1" relativeHeight="8">
               <wp:simplePos x="0" y="0"/>
               <wp:positionH relativeFrom="margin">
                 <wp:align>right</wp:align>
@@ -509,25 +546,31 @@
               <a:graphic xmlns:a="http://schemas.openxmlformats.org/drawingml/2006/main">
                 <a:graphicData uri="http://schemas.microsoft.com/office/word/2010/wordprocessingShape">
                   <wps:wsp>
-                    <wps:cNvSpPr txBox="1"/>
+                    <wps:cNvSpPr/>
                     <wps:spPr>
                       <a:xfrm>
                         <a:off x="0" y="0"/>
-                        <a:ext cx="14605" cy="14605"/>
+                        <a:ext cx="14760" cy="14760"/>
                       </a:xfrm>
-                      <a:prstGeom prst="rect"/>
-                      <a:solidFill>
-                        <a:srgbClr val="FFFFFF">
-                          <a:alpha val="0"/>
-                        </a:srgbClr>
-                      </a:solidFill>
+                      <a:prstGeom prst="rect">
+                        <a:avLst/>
+                      </a:prstGeom>
+                      <a:noFill/>
+                      <a:ln w="0">
+                        <a:noFill/>
+                      </a:ln>
                     </wps:spPr>
+                    <wps:style>
+                      <a:lnRef idx="0"/>
+                      <a:fillRef idx="0"/>
+                      <a:effectRef idx="0"/>
+                      <a:fontRef idx="minor"/>
+                    </wps:style>
                     <wps:txbx>
                       <w:txbxContent>
                         <w:p>
                           <w:pPr>
                             <w:pStyle w:val="Footer"/>
-                            <w:pBdr/>
                             <w:spacing w:before="0" w:after="120"/>
                             <w:rPr>
                               <w:rStyle w:val="PageNumber"/>
@@ -566,7 +609,7 @@
                         </w:p>
                       </w:txbxContent>
                     </wps:txbx>
-                    <wps:bodyPr anchor="t" lIns="0" tIns="0" rIns="0" bIns="0">
+                    <wps:bodyPr lIns="0" rIns="0" tIns="0" bIns="0" anchor="t">
                       <a:spAutoFit/>
                     </wps:bodyPr>
                   </wps:wsp>
@@ -577,14 +620,14 @@
         </mc:Choice>
         <mc:Fallback>
           <w:pict>
-            <v:rect fillcolor="#FFFFFF" style="position:absolute;rotation:-0;width:1.15pt;height:1.15pt;mso-wrap-distance-left:0pt;mso-wrap-distance-right:0pt;mso-wrap-distance-top:0pt;mso-wrap-distance-bottom:0pt;margin-top:0.05pt;mso-position-vertical-relative:text;margin-left:0pt;mso-position-horizontal:right;mso-position-horizontal-relative:margin">
-              <v:fill opacity="0f"/>
-              <v:textbox inset="0in,0in,0in,0in">
+            <v:rect id="shape_0" ID="Frame2" path="m0,0l-2147483645,0l-2147483645,-2147483646l0,-2147483646xe" fillcolor="white" stroked="f" o:allowincell="f" style="position:absolute;margin-left:0pt;margin-top:0.05pt;width:1.1pt;height:1.1pt;mso-wrap-style:square;v-text-anchor:top;mso-position-horizontal:right;mso-position-horizontal-relative:margin">
+              <v:fill o:detectmouseclick="t" type="solid" color2="black" opacity="0"/>
+              <v:stroke color="#3465a4" joinstyle="round" endcap="flat"/>
+              <v:textbox>
                 <w:txbxContent>
                   <w:p>
                     <w:pPr>
                       <w:pStyle w:val="Footer"/>
-                      <w:pBdr/>
                       <w:spacing w:before="0" w:after="120"/>
                       <w:rPr>
                         <w:rStyle w:val="PageNumber"/>
@@ -939,7 +982,7 @@
       <mc:AlternateContent>
         <mc:Choice Requires="wpg">
           <w:drawing>
-            <wp:anchor behindDoc="1" distT="1905" distB="6350" distL="4445" distR="635" simplePos="0" locked="0" layoutInCell="1" allowOverlap="1" relativeHeight="5">
+            <wp:anchor behindDoc="1" distT="635" distB="0" distL="0" distR="0" simplePos="0" locked="0" layoutInCell="1" allowOverlap="1" relativeHeight="4">
               <wp:simplePos x="0" y="0"/>
               <wp:positionH relativeFrom="column">
                 <wp:posOffset>5142865</wp:posOffset>
@@ -948,7 +991,7 @@
                 <wp:posOffset>856615</wp:posOffset>
               </wp:positionV>
               <wp:extent cx="1013460" cy="514985"/>
-              <wp:effectExtent l="0" t="635" r="0" b="0"/>
+              <wp:effectExtent l="1270" t="635" r="0" b="0"/>
               <wp:wrapNone/>
               <wp:docPr id="2" name="Grouper 8"/>
               <a:graphic xmlns:a="http://schemas.openxmlformats.org/drawingml/2006/main">
@@ -968,16 +1011,16 @@
                       <wps:cNvSpPr/>
                       <wps:spPr>
                         <a:xfrm>
-                          <a:off x="508680" y="20880"/>
-                          <a:ext cx="504720" cy="489600"/>
+                          <a:off x="509400" y="20880"/>
+                          <a:ext cx="504360" cy="489600"/>
                         </a:xfrm>
                         <a:custGeom>
                           <a:avLst/>
                           <a:gdLst>
-                            <a:gd name="textAreaLeft" fmla="*/ 0 w 286200"/>
-                            <a:gd name="textAreaRight" fmla="*/ 286560 w 286200"/>
+                            <a:gd name="textAreaLeft" fmla="*/ 0 w 285840"/>
+                            <a:gd name="textAreaRight" fmla="*/ 286560 w 285840"/>
                             <a:gd name="textAreaTop" fmla="*/ 0 h 277560"/>
-                            <a:gd name="textAreaBottom" fmla="*/ 277920 h 277560"/>
+                            <a:gd name="textAreaBottom" fmla="*/ 278280 h 277560"/>
                           </a:gdLst>
                           <a:ahLst/>
                           <a:rect l="textAreaLeft" t="textAreaTop" r="textAreaRight" b="textAreaBottom"/>
@@ -1114,15 +1157,15 @@
                       <wps:spPr>
                         <a:xfrm>
                           <a:off x="0" y="0"/>
-                          <a:ext cx="412920" cy="515160"/>
+                          <a:ext cx="412200" cy="515160"/>
                         </a:xfrm>
                         <a:custGeom>
                           <a:avLst/>
                           <a:gdLst>
-                            <a:gd name="textAreaLeft" fmla="*/ 0 w 234000"/>
-                            <a:gd name="textAreaRight" fmla="*/ 234360 w 234000"/>
+                            <a:gd name="textAreaLeft" fmla="*/ 0 w 233640"/>
+                            <a:gd name="textAreaRight" fmla="*/ 234360 w 233640"/>
                             <a:gd name="textAreaTop" fmla="*/ 0 h 291960"/>
-                            <a:gd name="textAreaBottom" fmla="*/ 292320 h 291960"/>
+                            <a:gd name="textAreaBottom" fmla="*/ 292680 h 291960"/>
                           </a:gdLst>
                           <a:ahLst/>
                           <a:rect l="textAreaLeft" t="textAreaTop" r="textAreaRight" b="textAreaBottom"/>
@@ -1199,14 +1242,14 @@
         </mc:Choice>
         <mc:Fallback>
           <w:pict>
-            <v:group id="shape_0" alt="Grouper 8" style="position:absolute;margin-left:404.95pt;margin-top:67.45pt;width:79.8pt;height:40.55pt" coordorigin="8099,1349" coordsize="1596,811"/>
+            <v:group id="shape_0" alt="Grouper 8" style="position:absolute;margin-left:404.95pt;margin-top:67.45pt;width:79.85pt;height:40.55pt" coordorigin="8099,1349" coordsize="1597,811"/>
           </w:pict>
         </mc:Fallback>
       </mc:AlternateContent>
       <mc:AlternateContent>
         <mc:Choice Requires="wpg">
           <w:drawing>
-            <wp:anchor behindDoc="1" distT="5080" distB="7620" distL="3810" distR="3175" simplePos="0" locked="0" layoutInCell="1" allowOverlap="1" relativeHeight="6">
+            <wp:anchor behindDoc="1" distT="635" distB="0" distL="0" distR="0" simplePos="0" locked="0" layoutInCell="1" allowOverlap="1" relativeHeight="5">
               <wp:simplePos x="0" y="0"/>
               <wp:positionH relativeFrom="column">
                 <wp:posOffset>5142230</wp:posOffset>
@@ -1242,9 +1285,9 @@
                           <a:avLst/>
                           <a:gdLst>
                             <a:gd name="textAreaLeft" fmla="*/ 0 w 300960"/>
-                            <a:gd name="textAreaRight" fmla="*/ 301320 w 300960"/>
+                            <a:gd name="textAreaRight" fmla="*/ 301680 w 300960"/>
                             <a:gd name="textAreaTop" fmla="*/ 0 h 289080"/>
-                            <a:gd name="textAreaBottom" fmla="*/ 289440 h 289080"/>
+                            <a:gd name="textAreaBottom" fmla="*/ 289800 h 289080"/>
                           </a:gdLst>
                           <a:ahLst/>
                           <a:rect l="textAreaLeft" t="textAreaTop" r="textAreaRight" b="textAreaBottom"/>
@@ -1392,15 +1435,15 @@
                       <wps:spPr>
                         <a:xfrm>
                           <a:off x="0" y="15840"/>
-                          <a:ext cx="387360" cy="494640"/>
+                          <a:ext cx="386640" cy="494640"/>
                         </a:xfrm>
                         <a:custGeom>
                           <a:avLst/>
                           <a:gdLst>
-                            <a:gd name="textAreaLeft" fmla="*/ 0 w 219600"/>
-                            <a:gd name="textAreaRight" fmla="*/ 219960 w 219600"/>
+                            <a:gd name="textAreaLeft" fmla="*/ 0 w 219240"/>
+                            <a:gd name="textAreaRight" fmla="*/ 219960 w 219240"/>
                             <a:gd name="textAreaTop" fmla="*/ 0 h 280440"/>
-                            <a:gd name="textAreaBottom" fmla="*/ 280800 h 280440"/>
+                            <a:gd name="textAreaBottom" fmla="*/ 281160 h 280440"/>
                           </a:gdLst>
                           <a:ahLst/>
                           <a:rect l="textAreaLeft" t="textAreaTop" r="textAreaRight" b="textAreaBottom"/>
@@ -1777,7 +1820,7 @@
       <mc:AlternateContent>
         <mc:Choice Requires="wpg">
           <w:drawing>
-            <wp:anchor behindDoc="1" distT="6985" distB="6985" distL="1905" distR="7620" simplePos="0" locked="0" layoutInCell="1" allowOverlap="1" relativeHeight="7">
+            <wp:anchor behindDoc="1" distT="0" distB="0" distL="0" distR="0" simplePos="0" locked="0" layoutInCell="1" allowOverlap="1" relativeHeight="6">
               <wp:simplePos x="0" y="0"/>
               <wp:positionH relativeFrom="column">
                 <wp:posOffset>5130800</wp:posOffset>
@@ -1786,7 +1829,7 @@
                 <wp:posOffset>2490470</wp:posOffset>
               </wp:positionV>
               <wp:extent cx="1000125" cy="500380"/>
-              <wp:effectExtent l="0" t="0" r="0" b="0"/>
+              <wp:effectExtent l="1270" t="0" r="0" b="0"/>
               <wp:wrapNone/>
               <wp:docPr id="8" name="Grouper 1"/>
               <a:graphic xmlns:a="http://schemas.openxmlformats.org/drawingml/2006/main">
@@ -1807,15 +1850,15 @@
                       <wps:spPr>
                         <a:xfrm>
                           <a:off x="0" y="5760"/>
-                          <a:ext cx="498960" cy="494640"/>
+                          <a:ext cx="498600" cy="494640"/>
                         </a:xfrm>
                         <a:custGeom>
                           <a:avLst/>
                           <a:gdLst>
-                            <a:gd name="textAreaLeft" fmla="*/ 0 w 282960"/>
-                            <a:gd name="textAreaRight" fmla="*/ 283320 w 282960"/>
+                            <a:gd name="textAreaLeft" fmla="*/ 0 w 282600"/>
+                            <a:gd name="textAreaRight" fmla="*/ 283320 w 282600"/>
                             <a:gd name="textAreaTop" fmla="*/ 0 h 280440"/>
-                            <a:gd name="textAreaBottom" fmla="*/ 280800 h 280440"/>
+                            <a:gd name="textAreaBottom" fmla="*/ 281160 h 280440"/>
                           </a:gdLst>
                           <a:ahLst/>
                           <a:rect l="textAreaLeft" t="textAreaTop" r="textAreaRight" b="textAreaBottom"/>
@@ -1990,16 +2033,16 @@
                       <wps:cNvSpPr/>
                       <wps:spPr>
                         <a:xfrm>
-                          <a:off x="556920" y="0"/>
-                          <a:ext cx="443160" cy="500400"/>
+                          <a:off x="557640" y="0"/>
+                          <a:ext cx="442440" cy="500400"/>
                         </a:xfrm>
                         <a:custGeom>
                           <a:avLst/>
                           <a:gdLst>
-                            <a:gd name="textAreaLeft" fmla="*/ 0 w 251280"/>
-                            <a:gd name="textAreaRight" fmla="*/ 251640 w 251280"/>
+                            <a:gd name="textAreaLeft" fmla="*/ 0 w 250920"/>
+                            <a:gd name="textAreaRight" fmla="*/ 251640 w 250920"/>
                             <a:gd name="textAreaTop" fmla="*/ 0 h 283680"/>
-                            <a:gd name="textAreaBottom" fmla="*/ 284040 h 283680"/>
+                            <a:gd name="textAreaBottom" fmla="*/ 284400 h 283680"/>
                           </a:gdLst>
                           <a:ahLst/>
                           <a:rect l="textAreaLeft" t="textAreaTop" r="textAreaRight" b="textAreaBottom"/>
@@ -2350,7 +2393,7 @@
       <mc:AlternateContent>
         <mc:Choice Requires="wpg">
           <w:drawing>
-            <wp:anchor behindDoc="1" distT="0" distB="0" distL="0" distR="0" simplePos="0" locked="0" layoutInCell="1" allowOverlap="1" relativeHeight="8">
+            <wp:anchor behindDoc="1" distT="0" distB="0" distL="0" distR="0" simplePos="0" locked="0" layoutInCell="1" allowOverlap="1" relativeHeight="7">
               <wp:simplePos x="0" y="0"/>
               <wp:positionH relativeFrom="column">
                 <wp:posOffset>-390525</wp:posOffset>
@@ -2437,12 +2480,12 @@
             <v:group id="shape_0" alt="Groupe 2" style="position:absolute;margin-left:-30.75pt;margin-top:136.5pt;width:313.35pt;height:203.25pt" coordorigin="-615,2730" coordsize="6267,4065">
               <v:rect id="shape_0" ID="Rectangle 30" path="m0,0l-2147483645,0l-2147483645,-2147483646l0,-2147483646xe" fillcolor="#0bbbef" stroked="f" o:allowincell="f" style="position:absolute;left:-175;top:3210;width:5826;height:3584;mso-wrap-style:none;v-text-anchor:middle">
                 <v:fill o:detectmouseclick="t" type="solid" color2="#f44410"/>
-                <v:stroke color="#3465a4" weight="3240" joinstyle="miter" endcap="flat"/>
+                <v:stroke color="#3465a4" weight="3240" joinstyle="round" endcap="flat"/>
                 <w10:wrap type="none"/>
               </v:rect>
               <v:rect id="shape_0" ID="Rectangle 31" path="m0,0l-2147483645,0l-2147483645,-2147483646l0,-2147483646xe" fillcolor="white" stroked="f" o:allowincell="f" style="position:absolute;left:-615;top:2730;width:5782;height:3625;mso-wrap-style:none;v-text-anchor:middle">
                 <v:fill o:detectmouseclick="t" type="solid" color2="black"/>
-                <v:stroke color="#3465a4" weight="3240" joinstyle="miter" endcap="flat"/>
+                <v:stroke color="#3465a4" weight="3240" joinstyle="round" endcap="flat"/>
                 <w10:wrap type="none"/>
               </v:rect>
             </v:group>
@@ -2602,6 +2645,7 @@
     <w:qFormat/>
     <w:pPr>
       <w:widowControl/>
+      <w:suppressAutoHyphens w:val="true"/>
       <w:bidi w:val="0"/>
       <w:spacing w:before="0" w:after="0"/>
       <w:jc w:val="left"/>

</xml_diff>